<commit_message>
EKG-KLT-PRS-08 — Hata Önleme (Poka-Yoke) Yönetimi Prosedürü
</commit_message>
<xml_diff>
--- a/EKG_Kalite_Yönetim_Sistemi/05_Üretime Başlangıç ve Hata Önleme/02_SP&EP2 - Hata Önleme ve Alternatif Kontrol/EKG-KLT-PRS-08_Hata Önleme (Poka-Yoke) Yönetimi Prosedürü.docx
+++ b/EKG_Kalite_Yönetim_Sistemi/05_Üretime Başlangıç ve Hata Önleme/02_SP&EP2 - Hata Önleme ve Alternatif Kontrol/EKG-KLT-PRS-08_Hata Önleme (Poka-Yoke) Yönetimi Prosedürü.docx
@@ -40,11 +40,12 @@
       <w:tblPr>
         <w:tblStyle w:val="LightShading-Accent1"/>
         <w:tblW w:type="auto" w:w="0"/>
+        <w:tblLayout w:type="fixed"/>
         <w:tblLook w:firstColumn="1" w:firstRow="1" w:lastColumn="0" w:lastRow="0" w:noHBand="0" w:noVBand="1" w:val="04A0"/>
       </w:tblPr>
       <w:tblGrid>
-        <w:gridCol w:w="4320"/>
-        <w:gridCol w:w="4320"/>
+        <w:gridCol w:w="2160"/>
+        <w:gridCol w:w="6480"/>
       </w:tblGrid>
       <w:tr>
         <w:trPr>
@@ -53,7 +54,7 @@
         </w:trPr>
         <w:tc>
           <w:tcPr>
-            <w:tcW w:type="dxa" w:w="4320"/>
+            <w:tcW w:type="dxa" w:w="2160"/>
           </w:tcPr>
           <w:p>
             <w:r>
@@ -66,7 +67,7 @@
         </w:tc>
         <w:tc>
           <w:tcPr>
-            <w:tcW w:type="dxa" w:w="4320"/>
+            <w:tcW w:type="dxa" w:w="6480"/>
           </w:tcPr>
           <w:p>
             <w:r>
@@ -84,7 +85,7 @@
         </w:trPr>
         <w:tc>
           <w:tcPr>
-            <w:tcW w:type="dxa" w:w="4320"/>
+            <w:tcW w:type="dxa" w:w="2160"/>
           </w:tcPr>
           <w:p>
             <w:r>
@@ -97,7 +98,7 @@
         </w:tc>
         <w:tc>
           <w:tcPr>
-            <w:tcW w:type="dxa" w:w="4320"/>
+            <w:tcW w:type="dxa" w:w="6480"/>
           </w:tcPr>
           <w:p>
             <w:r>
@@ -115,7 +116,7 @@
         </w:trPr>
         <w:tc>
           <w:tcPr>
-            <w:tcW w:type="dxa" w:w="4320"/>
+            <w:tcW w:type="dxa" w:w="2160"/>
           </w:tcPr>
           <w:p>
             <w:r>
@@ -128,7 +129,7 @@
         </w:tc>
         <w:tc>
           <w:tcPr>
-            <w:tcW w:type="dxa" w:w="4320"/>
+            <w:tcW w:type="dxa" w:w="6480"/>
           </w:tcPr>
           <w:p>
             <w:r>
@@ -146,7 +147,7 @@
         </w:trPr>
         <w:tc>
           <w:tcPr>
-            <w:tcW w:type="dxa" w:w="4320"/>
+            <w:tcW w:type="dxa" w:w="2160"/>
           </w:tcPr>
           <w:p>
             <w:r>
@@ -159,7 +160,7 @@
         </w:tc>
         <w:tc>
           <w:tcPr>
-            <w:tcW w:type="dxa" w:w="4320"/>
+            <w:tcW w:type="dxa" w:w="6480"/>
           </w:tcPr>
           <w:p>
             <w:r>
@@ -177,7 +178,7 @@
         </w:trPr>
         <w:tc>
           <w:tcPr>
-            <w:tcW w:type="dxa" w:w="4320"/>
+            <w:tcW w:type="dxa" w:w="2160"/>
           </w:tcPr>
           <w:p>
             <w:r>
@@ -190,7 +191,7 @@
         </w:tc>
         <w:tc>
           <w:tcPr>
-            <w:tcW w:type="dxa" w:w="4320"/>
+            <w:tcW w:type="dxa" w:w="6480"/>
           </w:tcPr>
           <w:p>
             <w:r>
@@ -208,7 +209,7 @@
         </w:trPr>
         <w:tc>
           <w:tcPr>
-            <w:tcW w:type="dxa" w:w="4320"/>
+            <w:tcW w:type="dxa" w:w="2160"/>
           </w:tcPr>
           <w:p>
             <w:r>
@@ -221,7 +222,7 @@
         </w:tc>
         <w:tc>
           <w:tcPr>
-            <w:tcW w:type="dxa" w:w="4320"/>
+            <w:tcW w:type="dxa" w:w="6480"/>
           </w:tcPr>
           <w:p>
             <w:r>
@@ -300,11 +301,12 @@
       <w:tblPr>
         <w:tblStyle w:val="LightShading-Accent1"/>
         <w:tblW w:type="auto" w:w="0"/>
+        <w:tblLayout w:type="fixed"/>
         <w:tblLook w:firstColumn="1" w:firstRow="1" w:lastColumn="0" w:lastRow="0" w:noHBand="0" w:noVBand="1" w:val="04A0"/>
       </w:tblPr>
       <w:tblGrid>
-        <w:gridCol w:w="4320"/>
-        <w:gridCol w:w="4320"/>
+        <w:gridCol w:w="2160"/>
+        <w:gridCol w:w="6480"/>
       </w:tblGrid>
       <w:tr>
         <w:trPr>
@@ -313,7 +315,7 @@
         </w:trPr>
         <w:tc>
           <w:tcPr>
-            <w:tcW w:type="dxa" w:w="4320"/>
+            <w:tcW w:type="dxa" w:w="2160"/>
           </w:tcPr>
           <w:p>
             <w:r>
@@ -326,7 +328,7 @@
         </w:tc>
         <w:tc>
           <w:tcPr>
-            <w:tcW w:type="dxa" w:w="4320"/>
+            <w:tcW w:type="dxa" w:w="6480"/>
           </w:tcPr>
           <w:p>
             <w:r>
@@ -344,7 +346,7 @@
         </w:trPr>
         <w:tc>
           <w:tcPr>
-            <w:tcW w:type="dxa" w:w="4320"/>
+            <w:tcW w:type="dxa" w:w="2160"/>
           </w:tcPr>
           <w:p>
             <w:r>
@@ -357,7 +359,7 @@
         </w:tc>
         <w:tc>
           <w:tcPr>
-            <w:tcW w:type="dxa" w:w="4320"/>
+            <w:tcW w:type="dxa" w:w="6480"/>
           </w:tcPr>
           <w:p>
             <w:r>
@@ -375,7 +377,7 @@
         </w:trPr>
         <w:tc>
           <w:tcPr>
-            <w:tcW w:type="dxa" w:w="4320"/>
+            <w:tcW w:type="dxa" w:w="2160"/>
           </w:tcPr>
           <w:p>
             <w:r>
@@ -388,7 +390,7 @@
         </w:tc>
         <w:tc>
           <w:tcPr>
-            <w:tcW w:type="dxa" w:w="4320"/>
+            <w:tcW w:type="dxa" w:w="6480"/>
           </w:tcPr>
           <w:p>
             <w:r>
@@ -406,7 +408,7 @@
         </w:trPr>
         <w:tc>
           <w:tcPr>
-            <w:tcW w:type="dxa" w:w="4320"/>
+            <w:tcW w:type="dxa" w:w="2160"/>
           </w:tcPr>
           <w:p>
             <w:r>
@@ -419,7 +421,7 @@
         </w:tc>
         <w:tc>
           <w:tcPr>
-            <w:tcW w:type="dxa" w:w="4320"/>
+            <w:tcW w:type="dxa" w:w="6480"/>
           </w:tcPr>
           <w:p>
             <w:r>
@@ -437,7 +439,7 @@
         </w:trPr>
         <w:tc>
           <w:tcPr>
-            <w:tcW w:type="dxa" w:w="4320"/>
+            <w:tcW w:type="dxa" w:w="2160"/>
           </w:tcPr>
           <w:p>
             <w:r>
@@ -450,7 +452,7 @@
         </w:tc>
         <w:tc>
           <w:tcPr>
-            <w:tcW w:type="dxa" w:w="4320"/>
+            <w:tcW w:type="dxa" w:w="6480"/>
           </w:tcPr>
           <w:p>
             <w:r>
@@ -468,7 +470,7 @@
         </w:trPr>
         <w:tc>
           <w:tcPr>
-            <w:tcW w:type="dxa" w:w="4320"/>
+            <w:tcW w:type="dxa" w:w="2160"/>
           </w:tcPr>
           <w:p>
             <w:r>
@@ -481,7 +483,7 @@
         </w:tc>
         <w:tc>
           <w:tcPr>
-            <w:tcW w:type="dxa" w:w="4320"/>
+            <w:tcW w:type="dxa" w:w="6480"/>
           </w:tcPr>
           <w:p>
             <w:r>

</xml_diff>